<commit_message>
Rename brand Ohel to Oel across all page copy and filenames
Matches the organization's domain name (oel.org.il). 40 text
occurrences replaced (Ohel→Oel, OHEL→OEL); no other changes.

Co-Authored-By: Claude Fable 5 <noreply@anthropic.com>
Claude-Session: https://claude.ai/code/session_01S22GsGDwY9o4j7fUg35FU1
</commit_message>
<xml_diff>
--- a/website-pages/03_Institutions_for_Boys.docx
+++ b/website-pages/03_Institutions_for_Boys.docx
@@ -50,7 +50,7 @@
         <w:rPr>
           <w:lang w:val="en-GB"/>
         </w:rPr>
-        <w:t xml:space="preserve">At Ohel, Torah education is rooted in tradition, with no compromise on values or standards. Our goal is to nurture moral character and personal growth while giving every student the attention he deserves.</w:t>
+        <w:t xml:space="preserve">At Oel, Torah education is rooted in tradition, with no compromise on values or standards. Our goal is to nurture moral character and personal growth while giving every student the attention he deserves.</w:t>
       </w:r>
     </w:p>
     <w:p>
@@ -388,7 +388,7 @@
         <w:rPr>
           <w:lang w:val="en-GB"/>
         </w:rPr>
-        <w:t>A professional Ohel school rooted in the local community, allowing children in southern Israel to receive high-quality support close to home. The school places particular emphasis on warmth, care, and a strong sense of community belonging.</w:t>
+        <w:t>A professional Oel school rooted in the local community, allowing children in southern Israel to receive high-quality support close to home. The school places particular emphasis on warmth, care, and a strong sense of community belonging.</w:t>
       </w:r>
     </w:p>
     <w:p>

</xml_diff>